<commit_message>
Release v2.2.0 breakthrough screening
</commit_message>
<xml_diff>
--- a/assets/matic-detailed-dd-startup-template.docx
+++ b/assets/matic-detailed-dd-startup-template.docx
@@ -1946,7 +1946,7 @@
           <w:p>
             <w:pPr>
               <w:spacing w:before="0" w:after="0" w:line="300" w:lineRule="exact"/>
-              <w:ind w:firstLineChars="0" w:left="0" w:firstLine="0"/>
+              <w:ind w:firstLine="0" w:firstLineChars="0" w:left="0"/>
               <w:jc w:val="center"/>
             </w:pPr>
             <w:r/>
@@ -1967,7 +1967,7 @@
           <w:p>
             <w:pPr>
               <w:spacing w:before="0" w:after="0" w:line="300" w:lineRule="exact"/>
-              <w:ind w:firstLineChars="0" w:left="0" w:firstLine="0"/>
+              <w:ind w:firstLine="0" w:firstLineChars="0" w:left="0"/>
               <w:jc w:val="center"/>
             </w:pPr>
             <w:r/>
@@ -1988,7 +1988,7 @@
           <w:p>
             <w:pPr>
               <w:spacing w:before="0" w:after="0" w:line="300" w:lineRule="exact"/>
-              <w:ind w:firstLineChars="0" w:left="0" w:firstLine="0"/>
+              <w:ind w:firstLine="0" w:firstLineChars="0" w:left="0"/>
               <w:jc w:val="center"/>
             </w:pPr>
             <w:r/>
@@ -2009,7 +2009,7 @@
           <w:p>
             <w:pPr>
               <w:spacing w:before="0" w:after="0" w:line="300" w:lineRule="exact"/>
-              <w:ind w:firstLineChars="0" w:left="0" w:firstLine="0"/>
+              <w:ind w:firstLine="0" w:firstLineChars="0" w:left="0"/>
               <w:jc w:val="center"/>
             </w:pPr>
             <w:r/>
@@ -2030,7 +2030,7 @@
           <w:p>
             <w:pPr>
               <w:spacing w:before="0" w:after="0" w:line="300" w:lineRule="exact"/>
-              <w:ind w:firstLineChars="0" w:left="0" w:firstLine="0"/>
+              <w:ind w:firstLine="0" w:firstLineChars="0" w:left="0"/>
               <w:jc w:val="center"/>
             </w:pPr>
             <w:r/>
@@ -2051,7 +2051,7 @@
           <w:p>
             <w:pPr>
               <w:spacing w:before="0" w:after="0" w:line="300" w:lineRule="exact"/>
-              <w:ind w:firstLineChars="0" w:left="0" w:firstLine="0"/>
+              <w:ind w:firstLine="0" w:firstLineChars="0" w:left="0"/>
               <w:jc w:val="center"/>
             </w:pPr>
             <w:r/>
@@ -2837,7 +2837,7 @@
     </w:tbl>
     <w:p>
       <w:r>
-        <w:t>说明：继承标准尽调的竞品与替代方案比较，建立暂定竞品矩阵并标注待专家验证；继承五层市场模型，市场规模不作为固定专家访谈重点。</w:t>
+        <w:t>说明：分别继承标准尽调的具体产品与方案比较、技术路线比较，建立CMP-P与CMP-R暂定矩阵并标注待专家验证；同步继承0到1突破、关键国产替代、路线成熟度与拥挤度判断，以及五层市场模型。</w:t>
       </w:r>
     </w:p>
     <w:p>

</xml_diff>

<commit_message>
feat: add horizontal competitor comparison matrices
</commit_message>
<xml_diff>
--- a/assets/matic-detailed-dd-startup-template.docx
+++ b/assets/matic-detailed-dd-startup-template.docx
@@ -877,7 +877,7 @@
           <w:p>
             <w:pPr>
               <w:spacing w:before="0" w:after="0" w:line="300" w:lineRule="exact"/>
-              <w:ind w:firstLineChars="0" w:left="0" w:firstLine="0"/>
+              <w:ind w:firstLine="0" w:firstLineChars="0" w:left="0"/>
               <w:jc w:val="center"/>
             </w:pPr>
             <w:r/>
@@ -898,7 +898,7 @@
           <w:p>
             <w:pPr>
               <w:spacing w:before="0" w:after="0" w:line="300" w:lineRule="exact"/>
-              <w:ind w:firstLineChars="0" w:left="0" w:firstLine="0"/>
+              <w:ind w:firstLine="0" w:firstLineChars="0" w:left="0"/>
               <w:jc w:val="center"/>
             </w:pPr>
             <w:r/>
@@ -919,7 +919,7 @@
           <w:p>
             <w:pPr>
               <w:spacing w:before="0" w:after="0" w:line="300" w:lineRule="exact"/>
-              <w:ind w:firstLineChars="0" w:left="0" w:firstLine="0"/>
+              <w:ind w:firstLine="0" w:firstLineChars="0" w:left="0"/>
               <w:jc w:val="center"/>
             </w:pPr>
             <w:r/>
@@ -2837,7 +2837,7 @@
     </w:tbl>
     <w:p>
       <w:r>
-        <w:t>说明：分别继承标准尽调的具体产品与方案比较、技术路线比较，建立CMP-P与CMP-R暂定矩阵并标注待专家验证；同步继承0到1突破、关键国产替代、路线成熟度与拥挤度判断，以及五层市场模型。</w:t>
+        <w:t>说明：分别继承标准尽调的具体产品与方案横向矩阵、技术路线横向矩阵，在工作台拆解为CMP-P与CMP-R证据长表并标注待专家验证；报告成文时再按维度转置为横向矩阵。同步继承0到1突破、关键国产替代、路线成熟度与拥挤度判断，以及五层市场模型。</w:t>
       </w:r>
     </w:p>
     <w:p>
@@ -4568,7 +4568,7 @@
           <w:p>
             <w:pPr>
               <w:spacing w:before="0" w:after="0" w:line="300" w:lineRule="exact"/>
-              <w:ind w:firstLine="0" w:firstLineChars="0" w:left="0"/>
+              <w:ind w:firstLineChars="0" w:left="0" w:firstLine="0"/>
               <w:jc w:val="left"/>
             </w:pPr>
             <w:r/>
@@ -4589,7 +4589,7 @@
           <w:p>
             <w:pPr>
               <w:spacing w:before="0" w:after="0" w:line="300" w:lineRule="exact"/>
-              <w:ind w:firstLine="0" w:firstLineChars="0" w:left="0"/>
+              <w:ind w:firstLineChars="0" w:left="0" w:firstLine="0"/>
               <w:jc w:val="left"/>
             </w:pPr>
             <w:r/>
@@ -4610,7 +4610,7 @@
           <w:p>
             <w:pPr>
               <w:spacing w:before="0" w:after="0" w:line="300" w:lineRule="exact"/>
-              <w:ind w:firstLine="0" w:firstLineChars="0" w:left="0"/>
+              <w:ind w:firstLineChars="0" w:left="0" w:firstLine="0"/>
               <w:jc w:val="left"/>
             </w:pPr>
             <w:r/>
@@ -4631,7 +4631,7 @@
           <w:p>
             <w:pPr>
               <w:spacing w:before="0" w:after="0" w:line="300" w:lineRule="exact"/>
-              <w:ind w:firstLine="0" w:firstLineChars="0" w:left="0"/>
+              <w:ind w:firstLineChars="0" w:left="0" w:firstLine="0"/>
               <w:jc w:val="left"/>
             </w:pPr>
             <w:r/>
@@ -4652,7 +4652,7 @@
           <w:p>
             <w:pPr>
               <w:spacing w:before="0" w:after="0" w:line="300" w:lineRule="exact"/>
-              <w:ind w:firstLine="0" w:firstLineChars="0" w:left="0"/>
+              <w:ind w:firstLineChars="0" w:left="0" w:firstLine="0"/>
               <w:jc w:val="left"/>
             </w:pPr>
             <w:r/>
@@ -4673,7 +4673,7 @@
           <w:p>
             <w:pPr>
               <w:spacing w:before="0" w:after="0" w:line="300" w:lineRule="exact"/>
-              <w:ind w:firstLine="0" w:firstLineChars="0" w:left="0"/>
+              <w:ind w:firstLineChars="0" w:left="0" w:firstLine="0"/>
               <w:jc w:val="left"/>
             </w:pPr>
             <w:r/>
@@ -4827,7 +4827,7 @@
           <w:p>
             <w:pPr>
               <w:spacing w:before="0" w:after="0" w:line="300" w:lineRule="exact"/>
-              <w:ind w:firstLine="0" w:firstLineChars="0" w:left="0"/>
+              <w:ind w:firstLineChars="0" w:left="0" w:firstLine="0"/>
               <w:jc w:val="center"/>
             </w:pPr>
             <w:r/>
@@ -5083,7 +5083,7 @@
           <w:p>
             <w:pPr>
               <w:spacing w:before="0" w:after="0" w:line="300" w:lineRule="exact"/>
-              <w:ind w:firstLine="0" w:firstLineChars="0" w:left="0"/>
+              <w:ind w:firstLineChars="0" w:left="0" w:firstLine="0"/>
               <w:jc w:val="left"/>
             </w:pPr>
             <w:r/>
@@ -5339,7 +5339,7 @@
           <w:p>
             <w:pPr>
               <w:spacing w:before="0" w:after="0" w:line="300" w:lineRule="exact"/>
-              <w:ind w:firstLine="0" w:firstLineChars="0" w:left="0"/>
+              <w:ind w:firstLineChars="0" w:left="0" w:firstLine="0"/>
               <w:jc w:val="left"/>
             </w:pPr>
             <w:r/>

</xml_diff>